<commit_message>
Add CI and OpenAPI export packaging
</commit_message>
<xml_diff>
--- a/docs/technical_report.docx
+++ b/docs/technical_report.docx
@@ -1155,17 +1155,17 @@
     </w:p>
     <w:p>
       <w:r>
-        <w:t>- Average latency: 0.1543</w:t>
+        <w:t>- Average latency: 0.2403</w:t>
       </w:r>
     </w:p>
     <w:p>
       <w:r>
-        <w:t>- p50 latency: 0.1328</w:t>
+        <w:t>- p50 latency: 0.1662</w:t>
       </w:r>
     </w:p>
     <w:p>
       <w:r>
-        <w:t>- p95 latency: 0.3043</w:t>
+        <w:t>- p95 latency: 0.549</w:t>
       </w:r>
     </w:p>
     <w:p>

</xml_diff>

<commit_message>
Add deliverable verification gate
</commit_message>
<xml_diff>
--- a/docs/technical_report.docx
+++ b/docs/technical_report.docx
@@ -1155,17 +1155,17 @@
     </w:p>
     <w:p>
       <w:r>
-        <w:t>- Average latency: 0.2403</w:t>
+        <w:t>- Average latency: 0.3183</w:t>
       </w:r>
     </w:p>
     <w:p>
       <w:r>
-        <w:t>- p50 latency: 0.1662</w:t>
+        <w:t>- p50 latency: 0.2329</w:t>
       </w:r>
     </w:p>
     <w:p>
       <w:r>
-        <w:t>- p95 latency: 0.549</w:t>
+        <w:t>- p95 latency: 0.9014</w:t>
       </w:r>
     </w:p>
     <w:p>

</xml_diff>

<commit_message>
Add release and defense deliverables
</commit_message>
<xml_diff>
--- a/docs/technical_report.docx
+++ b/docs/technical_report.docx
@@ -1155,17 +1155,17 @@
     </w:p>
     <w:p>
       <w:r>
-        <w:t>- Average latency: 0.3183</w:t>
+        <w:t>- Average latency: 0.1615</w:t>
       </w:r>
     </w:p>
     <w:p>
       <w:r>
-        <w:t>- p50 latency: 0.2329</w:t>
+        <w:t>- p50 latency: 0.0871</w:t>
       </w:r>
     </w:p>
     <w:p>
       <w:r>
-        <w:t>- p95 latency: 0.9014</w:t>
+        <w:t>- p95 latency: 0.3416</w:t>
       </w:r>
     </w:p>
     <w:p>

</xml_diff>

<commit_message>
Add GitHub publish readiness workflow
</commit_message>
<xml_diff>
--- a/docs/technical_report.docx
+++ b/docs/technical_report.docx
@@ -1155,17 +1155,17 @@
     </w:p>
     <w:p>
       <w:r>
-        <w:t>- Average latency: 0.1615</w:t>
+        <w:t>- Average latency: 0.1925</w:t>
       </w:r>
     </w:p>
     <w:p>
       <w:r>
-        <w:t>- p50 latency: 0.0871</w:t>
+        <w:t>- p50 latency: 0.1006</w:t>
       </w:r>
     </w:p>
     <w:p>
       <w:r>
-        <w:t>- p95 latency: 0.3416</w:t>
+        <w:t>- p95 latency: 0.4635</w:t>
       </w:r>
     </w:p>
     <w:p>

</xml_diff>

<commit_message>
Document GitHub repository target
</commit_message>
<xml_diff>
--- a/docs/technical_report.docx
+++ b/docs/technical_report.docx
@@ -1155,17 +1155,17 @@
     </w:p>
     <w:p>
       <w:r>
-        <w:t>- Average latency: 0.1925</w:t>
+        <w:t>- Average latency: 0.4029</w:t>
       </w:r>
     </w:p>
     <w:p>
       <w:r>
-        <w:t>- p50 latency: 0.1006</w:t>
+        <w:t>- p50 latency: 0.2153</w:t>
       </w:r>
     </w:p>
     <w:p>
       <w:r>
-        <w:t>- p95 latency: 0.4635</w:t>
+        <w:t>- p95 latency: 1.0578</w:t>
       </w:r>
     </w:p>
     <w:p>

</xml_diff>

<commit_message>
Add submission package verification
</commit_message>
<xml_diff>
--- a/docs/technical_report.docx
+++ b/docs/technical_report.docx
@@ -1155,17 +1155,17 @@
     </w:p>
     <w:p>
       <w:r>
-        <w:t>- Average latency: 0.4029</w:t>
+        <w:t>- Average latency: 0.1909</w:t>
       </w:r>
     </w:p>
     <w:p>
       <w:r>
-        <w:t>- p50 latency: 0.2153</w:t>
+        <w:t>- p50 latency: 0.0972</w:t>
       </w:r>
     </w:p>
     <w:p>
       <w:r>
-        <w:t>- p95 latency: 1.0578</w:t>
+        <w:t>- p95 latency: 0.4326</w:t>
       </w:r>
     </w:p>
     <w:p>

</xml_diff>

<commit_message>
Add connector template generator
</commit_message>
<xml_diff>
--- a/docs/technical_report.docx
+++ b/docs/technical_report.docx
@@ -512,7 +512,7 @@
     </w:p>
     <w:p>
       <w:r>
-        <w:t>ClawFlow 提供 CLI、FastAPI 和 Web UI 三类入口。CLI 面向开发者和答辩演示，支持 run、serve、trace、memory、resume、tools、app、benchmark。FastAPI 提供 /health、/run、/runs、/runs/{run_id}/trace、/runs/{run_id}/resume、/tools、/memory、/plugins、/benchmark、/audit、/governance、/workflow、/applications。Web UI 读取真实 SQLite、JSON 和输出文件，包含首页、Run Agent、Runs、Trace Timeline、Memory、Tools、Plugins、Applications、Benchmark、Governance、Audit Log、Workflow Graph、Multi-agent、RAG、Roadmap。</w:t>
+        <w:t>ClawFlow 提供 CLI、FastAPI 和 Web UI 三类入口。CLI 面向开发者和答辩演示，支持 run、serve、trace、memory、resume、tools、app、benchmark，以及 generate app/tool/connector 开发者模板。FastAPI 提供 /health、/run、/runs、/runs/{run_id}/trace、/runs/{run_id}/resume、/tools、/memory、/plugins、/benchmark、/audit、/governance、/workflow、/applications、/templates/app、/templates/tool 和 /templates/connector。Web UI 读取真实 SQLite、JSON 和输出文件，包含首页、Run Agent、Runs、Trace Timeline、Memory、Tools、Plugins、Applications、Benchmark、Governance、Audit Log、Workflow Graph、Multi-agent、RAG、Roadmap 与 Template Generator。</w:t>
       </w:r>
     </w:p>
     <w:p>
@@ -526,6 +526,11 @@
     <w:p>
       <w:r>
         <w:t>插件系统由 plugin_manifest.json、PluginLoader 和 DynamicPluginTool 组成。当前实现包含 plugin_workspace_stats 和 plugin_echo，前者读取真实工作区文件数量并写入 outputs/plugin_workspace_stats.json，后者展示动态工具调用。插件工具会真实进入 Tool Registry，因此 CLI、Runtime 和 Web UI 都可以看到它们。该机制为 MCP、企业 API、第三方 SaaS 工具和自定义工具接入预留标准化接口。</w:t>
+      </w:r>
+    </w:p>
+    <w:p>
+      <w:r>
+        <w:t>本轮进一步加入 Connector Template Generator。开发者可以通过 CLI、API 或 Web UI 生成继承 ConnectorBase 的 MCP-like connector scaffold。生成的连接器不是空壳：本地适配器会把 operation、payload、timestamp 和 connector 名称追加写入 outputs/connectors/&lt;name&gt;/events.jsonl，从而在无企业 API 账号时仍能展示真实状态、真实文件和真实可测试数据流；生产接入时只需要替换 _call_remote_service 边界即可对接工单、CRM、日历、知识库或 MCP 服务端。</w:t>
       </w:r>
     </w:p>
     <w:p>
@@ -1155,17 +1160,17 @@
     </w:p>
     <w:p>
       <w:r>
-        <w:t>- Average latency: 0.1909</w:t>
+        <w:t>- Average latency: 0.1882</w:t>
       </w:r>
     </w:p>
     <w:p>
       <w:r>
-        <w:t>- p50 latency: 0.0972</w:t>
+        <w:t>- p50 latency: 0.1595</w:t>
       </w:r>
     </w:p>
     <w:p>
       <w:r>
-        <w:t>- p95 latency: 0.4326</w:t>
+        <w:t>- p95 latency: 0.4161</w:t>
       </w:r>
     </w:p>
     <w:p>

</xml_diff>